<commit_message>
Corrección en los escenarios y las especificaciones
</commit_message>
<xml_diff>
--- a/Fase#1/Modelo de Requisitos/Descripción de Tutorías UTDP y Escenarios.docx
+++ b/Fase#1/Modelo de Requisitos/Descripción de Tutorías UTDP y Escenarios.docx
@@ -67,21 +67,7 @@
           <w:rFonts w:ascii="Times New Roman" w:hAnsi="Times New Roman" w:cs="Times New Roman"/>
           <w:lang w:val="es-ES"/>
         </w:rPr>
-        <w:t>. Su objetivo es ofrecer un espacio donde tú, como estudiante, puedas participar en sesiones de tutoría de cualquier materia, guiado por otro estudiante que ha pasado por las mismas experiencias y comprende los retos académicos que enfrentas.</w:t>
-      </w:r>
-      <w:r>
-        <w:rPr>
-          <w:rFonts w:ascii="Times New Roman" w:hAnsi="Times New Roman" w:cs="Times New Roman"/>
-          <w:lang w:val="es-ES"/>
-        </w:rPr>
-        <w:t xml:space="preserve"> </w:t>
-      </w:r>
-      <w:r>
-        <w:rPr>
-          <w:rFonts w:ascii="Times New Roman" w:hAnsi="Times New Roman" w:cs="Times New Roman"/>
-          <w:lang w:val="es-ES"/>
-        </w:rPr>
-        <w:t>Además, podrás evaluar a los tutores que te impartan las sesiones, brindándoles retroalimentación activa sobre su desempeño y contribuyendo al crecimiento mutuo dentro de la comunidad académica.</w:t>
+        <w:t>. Su objetivo es ofrecer un espacio donde tú, como estudiante, puedas participar en sesiones de tutoría de cualquier materia, guiado por otro estudiante que ha pasado por las mismas experiencias y comprende los retos académicos que enfrentas. Además, podrás evaluar a los tutores que te impartan las sesiones, brindándoles retroalimentación activa sobre su desempeño y contribuyendo al crecimiento mutuo dentro de la comunidad académica.</w:t>
       </w:r>
     </w:p>
     <w:p>
@@ -240,7 +226,7 @@
           <w:iCs/>
           <w:lang w:val="es-ES"/>
         </w:rPr>
-        <w:t>Solicitar tutorías</w:t>
+        <w:t>Solicitar tutoría</w:t>
       </w:r>
       <w:r>
         <w:rPr>
@@ -307,14 +293,53 @@
           <w:rFonts w:ascii="Times New Roman" w:hAnsi="Times New Roman" w:cs="Times New Roman"/>
           <w:lang w:val="es-ES"/>
         </w:rPr>
-        <w:t xml:space="preserve">y </w:t>
-      </w:r>
-      <w:r>
-        <w:rPr>
-          <w:rFonts w:ascii="Times New Roman" w:hAnsi="Times New Roman" w:cs="Times New Roman"/>
-          <w:lang w:val="es-ES"/>
-        </w:rPr>
-        <w:t xml:space="preserve">luego de 2 segundos </w:t>
+        <w:t>y</w:t>
+      </w:r>
+      <w:r>
+        <w:rPr>
+          <w:rFonts w:ascii="Times New Roman" w:hAnsi="Times New Roman" w:cs="Times New Roman"/>
+          <w:lang w:val="es-ES"/>
+        </w:rPr>
+        <w:t xml:space="preserve"> botón </w:t>
+      </w:r>
+      <w:r>
+        <w:rPr>
+          <w:rFonts w:ascii="Times New Roman" w:hAnsi="Times New Roman" w:cs="Times New Roman"/>
+          <w:i/>
+          <w:iCs/>
+          <w:lang w:val="es-ES"/>
+        </w:rPr>
+        <w:t>Cerrar.</w:t>
+      </w:r>
+      <w:r>
+        <w:rPr>
+          <w:rFonts w:ascii="Times New Roman" w:hAnsi="Times New Roman" w:cs="Times New Roman"/>
+          <w:lang w:val="es-ES"/>
+        </w:rPr>
+        <w:t xml:space="preserve"> </w:t>
+      </w:r>
+      <w:r>
+        <w:rPr>
+          <w:rFonts w:ascii="Times New Roman" w:hAnsi="Times New Roman" w:cs="Times New Roman"/>
+          <w:lang w:val="es-ES"/>
+        </w:rPr>
+        <w:t xml:space="preserve">Cuando hace clic en el botón </w:t>
+      </w:r>
+      <w:r>
+        <w:rPr>
+          <w:rFonts w:ascii="Times New Roman" w:hAnsi="Times New Roman" w:cs="Times New Roman"/>
+          <w:i/>
+          <w:iCs/>
+          <w:lang w:val="es-ES"/>
+        </w:rPr>
+        <w:t>Cerrar</w:t>
+      </w:r>
+      <w:r>
+        <w:rPr>
+          <w:rFonts w:ascii="Times New Roman" w:hAnsi="Times New Roman" w:cs="Times New Roman"/>
+          <w:lang w:val="es-ES"/>
+        </w:rPr>
+        <w:t xml:space="preserve"> </w:t>
       </w:r>
       <w:r>
         <w:rPr>
@@ -410,16 +435,7 @@
           <w:szCs w:val="28"/>
           <w:lang w:val="es-ES"/>
         </w:rPr>
-        <w:t xml:space="preserve">Tipo de caso cumplido: </w:t>
-      </w:r>
-      <w:r>
-        <w:rPr>
-          <w:rFonts w:ascii="Times New Roman" w:hAnsi="Times New Roman" w:cs="Times New Roman"/>
-          <w:sz w:val="28"/>
-          <w:szCs w:val="28"/>
-          <w:lang w:val="es-ES"/>
-        </w:rPr>
-        <w:t>UPDATE</w:t>
+        <w:t>Tipo de caso cumplido: UPDATE</w:t>
       </w:r>
     </w:p>
     <w:p>
@@ -574,7 +590,7 @@
           <w:iCs/>
           <w:lang w:val="es-ES"/>
         </w:rPr>
-        <w:t>Cambiar</w:t>
+        <w:t>Guardar</w:t>
       </w:r>
       <w:r>
         <w:rPr>
@@ -590,7 +606,7 @@
           <w:iCs/>
           <w:lang w:val="es-ES"/>
         </w:rPr>
-        <w:t>Cambiar</w:t>
+        <w:t>Guardar</w:t>
       </w:r>
       <w:r>
         <w:rPr>
@@ -835,14 +851,32 @@
           <w:rFonts w:ascii="Times New Roman" w:hAnsi="Times New Roman" w:cs="Times New Roman"/>
           <w:lang w:val="es-ES"/>
         </w:rPr>
-        <w:t xml:space="preserve">selecciona la opción Sesiones </w:t>
-      </w:r>
-      <w:r>
-        <w:rPr>
-          <w:rFonts w:ascii="Times New Roman" w:hAnsi="Times New Roman" w:cs="Times New Roman"/>
-          <w:lang w:val="es-ES"/>
-        </w:rPr>
-        <w:t xml:space="preserve">Pendientes </w:t>
+        <w:t xml:space="preserve">selecciona la opción </w:t>
+      </w:r>
+      <w:r>
+        <w:rPr>
+          <w:rFonts w:ascii="Times New Roman" w:hAnsi="Times New Roman" w:cs="Times New Roman"/>
+          <w:i/>
+          <w:iCs/>
+          <w:lang w:val="es-ES"/>
+        </w:rPr>
+        <w:t xml:space="preserve">Sesiones </w:t>
+      </w:r>
+      <w:r>
+        <w:rPr>
+          <w:rFonts w:ascii="Times New Roman" w:hAnsi="Times New Roman" w:cs="Times New Roman"/>
+          <w:i/>
+          <w:iCs/>
+          <w:lang w:val="es-ES"/>
+        </w:rPr>
+        <w:t>Pendientes</w:t>
+      </w:r>
+      <w:r>
+        <w:rPr>
+          <w:rFonts w:ascii="Times New Roman" w:hAnsi="Times New Roman" w:cs="Times New Roman"/>
+          <w:lang w:val="es-ES"/>
+        </w:rPr>
+        <w:t xml:space="preserve"> </w:t>
       </w:r>
       <w:r>
         <w:rPr>
@@ -970,10 +1004,6 @@
     </w:sectPr>
   </w:body>
 </w:document>
-</file>
-
-<file path=word/numbering.xml><?xml version="1.0" encoding="utf-8"?>
-<w:numbering xmlns:wpc="http://schemas.microsoft.com/office/word/2010/wordprocessingCanvas" xmlns:cx="http://schemas.microsoft.com/office/drawing/2014/chartex" xmlns:cx1="http://schemas.microsoft.com/office/drawing/2015/9/8/chartex" xmlns:cx2="http://schemas.microsoft.com/office/drawing/2015/10/21/chartex" xmlns:cx3="http://schemas.microsoft.com/office/drawing/2016/5/9/chartex" xmlns:cx4="http://schemas.microsoft.com/office/drawing/2016/5/10/chartex" xmlns:cx5="http://schemas.microsoft.com/office/drawing/2016/5/11/chartex" xmlns:cx6="http://schemas.microsoft.com/office/drawing/2016/5/12/chartex" xmlns:cx7="http://schemas.microsoft.com/office/drawing/2016/5/13/chartex" xmlns:cx8="http://schemas.microsoft.com/office/drawing/2016/5/14/chartex" xmlns:mc="http://schemas.openxmlformats.org/markup-compatibility/2006" xmlns:aink="http://schemas.microsoft.com/office/drawing/2016/ink" xmlns:am3d="http://schemas.microsoft.com/office/drawing/2017/model3d" xmlns:o="urn:schemas-microsoft-com:office:office" xmlns:oel="http://schemas.microsoft.com/office/2019/extlst" xmlns:r="http://schemas.openxmlformats.org/officeDocument/2006/relationships" xmlns:m="http://schemas.openxmlformats.org/officeDocument/2006/math" xmlns:v="urn:schemas-microsoft-com:vml" xmlns:wp14="http://schemas.microsoft.com/office/word/2010/wordprocessingDrawing" xmlns:wp="http://schemas.openxmlformats.org/drawingml/2006/wordprocessingDrawing" xmlns:w10="urn:schemas-microsoft-com:office:word" xmlns:w="http://schemas.openxmlformats.org/wordprocessingml/2006/main" xmlns:w14="http://schemas.microsoft.com/office/word/2010/wordml" xmlns:w15="http://schemas.microsoft.com/office/word/2012/wordml" xmlns:w16cex="http://schemas.microsoft.com/office/word/2018/wordml/cex" xmlns:w16cid="http://schemas.microsoft.com/office/word/2016/wordml/cid" xmlns:w16="http://schemas.microsoft.com/office/word/2018/wordml" xmlns:w16du="http://schemas.microsoft.com/office/word/2023/wordml/word16du" xmlns:w16sdtdh="http://schemas.microsoft.com/office/word/2020/wordml/sdtdatahash" xmlns:w16sdtfl="http://schemas.microsoft.com/office/word/2024/wordml/sdtformatlock" xmlns:w16se="http://schemas.microsoft.com/office/word/2015/wordml/symex" xmlns:wpg="http://schemas.microsoft.com/office/word/2010/wordprocessingGroup" xmlns:wpi="http://schemas.microsoft.com/office/word/2010/wordprocessingInk" xmlns:wne="http://schemas.microsoft.com/office/word/2006/wordml" xmlns:wps="http://schemas.microsoft.com/office/word/2010/wordprocessingShape" mc:Ignorable="w14 w15 w16se w16cid w16 w16cex w16sdtdh w16sdtfl w16du wp14"/>
 </file>
 
 <file path=word/styles.xml><?xml version="1.0" encoding="utf-8"?>

</xml_diff>